<commit_message>
Versione usata per verificare LLM con i 10 esperimenti
</commit_message>
<xml_diff>
--- a/documentation/Fork assembly instruction1.docx
+++ b/documentation/Fork assembly instruction1.docx
@@ -5446,7 +5446,26 @@
           <w:szCs w:val="32"/>
           <w:lang w:val="en-US"/>
         </w:rPr>
-        <w:t xml:space="preserve">that the hole in the protruding part of each </w:t>
+        <w:t xml:space="preserve">that the hole in the protruding part of </w:t>
+      </w:r>
+      <w:r>
+        <w:rPr>
+          <w:rFonts w:ascii="Aptos" w:hAnsi="Aptos"/>
+          <w:sz w:val="32"/>
+          <w:szCs w:val="32"/>
+          <w:u w:val="single"/>
+          <w:lang w:val="en-US"/>
+        </w:rPr>
+        <w:t>each</w:t>
+      </w:r>
+      <w:r>
+        <w:rPr>
+          <w:rFonts w:ascii="Aptos" w:hAnsi="Aptos"/>
+          <w:sz w:val="32"/>
+          <w:szCs w:val="32"/>
+          <w:lang w:val="en-US"/>
+        </w:rPr>
+        <w:t xml:space="preserve"> </w:t>
       </w:r>
       <w:r>
         <w:rPr>
@@ -5548,6 +5567,7 @@
         </w:rPr>
         <w:t xml:space="preserve"> </w:t>
       </w:r>
+      <w:proofErr w:type="gramStart"/>
       <w:r>
         <w:rPr>
           <w:rFonts w:ascii="Aptos" w:hAnsi="Aptos"/>
@@ -5585,7 +5605,17 @@
           <w:szCs w:val="32"/>
           <w:lang w:val="en-US"/>
         </w:rPr>
-        <w:t xml:space="preserve">, so that the hole is </w:t>
+        <w:t>,</w:t>
+      </w:r>
+      <w:proofErr w:type="gramEnd"/>
+      <w:r>
+        <w:rPr>
+          <w:rFonts w:ascii="Aptos" w:hAnsi="Aptos"/>
+          <w:sz w:val="32"/>
+          <w:szCs w:val="32"/>
+          <w:lang w:val="en-US"/>
+        </w:rPr>
+        <w:t xml:space="preserve"> so that the hole is </w:t>
       </w:r>
       <w:r>
         <w:rPr>
@@ -6164,18 +6194,42 @@
           <w:szCs w:val="32"/>
           <w:lang w:val="en-US"/>
         </w:rPr>
-        <w:t>Required pieces for creating  P</w:t>
-      </w:r>
-      <w:r>
-        <w:rPr>
-          <w:rFonts w:ascii="Aptos" w:hAnsi="Aptos"/>
-          <w:b/>
-          <w:bCs/>
-          <w:sz w:val="32"/>
-          <w:szCs w:val="32"/>
-          <w:lang w:val="en-US"/>
-        </w:rPr>
-        <w:t>iece 5</w:t>
+        <w:t xml:space="preserve">Required pieces for </w:t>
+      </w:r>
+      <w:proofErr w:type="gramStart"/>
+      <w:r>
+        <w:rPr>
+          <w:rFonts w:ascii="Aptos" w:hAnsi="Aptos"/>
+          <w:b/>
+          <w:bCs/>
+          <w:sz w:val="32"/>
+          <w:szCs w:val="32"/>
+          <w:lang w:val="en-US"/>
+        </w:rPr>
+        <w:t>creating  P</w:t>
+      </w:r>
+      <w:r>
+        <w:rPr>
+          <w:rFonts w:ascii="Aptos" w:hAnsi="Aptos"/>
+          <w:b/>
+          <w:bCs/>
+          <w:sz w:val="32"/>
+          <w:szCs w:val="32"/>
+          <w:lang w:val="en-US"/>
+        </w:rPr>
+        <w:t>iece</w:t>
+      </w:r>
+      <w:proofErr w:type="gramEnd"/>
+      <w:r>
+        <w:rPr>
+          <w:rFonts w:ascii="Aptos" w:hAnsi="Aptos"/>
+          <w:b/>
+          <w:bCs/>
+          <w:sz w:val="32"/>
+          <w:szCs w:val="32"/>
+          <w:lang w:val="en-US"/>
+        </w:rPr>
+        <w:t xml:space="preserve"> 5</w:t>
       </w:r>
       <w:r>
         <w:rPr>

</xml_diff>